<commit_message>
code should be done
</commit_message>
<xml_diff>
--- a/hw4/Homework 4.docx
+++ b/hw4/Homework 4.docx
@@ -362,7 +362,21 @@
           <w:rFonts w:eastAsiaTheme="minorEastAsia"/>
           <w:iCs/>
         </w:rPr>
-        <w:t xml:space="preserve"> is a low-pass signal. Only low frequencies retain their spectral power, while higher frequencies fall off exponentially. </w:t>
+        <w:t xml:space="preserve"> is a low-pass signal.</w:t>
+      </w:r>
+      <w:r>
+        <w:rPr>
+          <w:rFonts w:eastAsiaTheme="minorEastAsia"/>
+          <w:iCs/>
+        </w:rPr>
+        <w:t xml:space="preserve"> Low frequencies see little to no attenuation, while high frequencies see reduction in power by orders of magnitude</w:t>
+      </w:r>
+      <w:r>
+        <w:rPr>
+          <w:rFonts w:eastAsiaTheme="minorEastAsia"/>
+          <w:iCs/>
+        </w:rPr>
+        <w:t xml:space="preserve">. </w:t>
       </w:r>
     </w:p>
     <w:p>
@@ -1010,267 +1024,6 @@
     </w:p>
     <w:p>
       <w:pPr>
-        <w:pStyle w:val="Heading3"/>
-      </w:pPr>
-      <w:r>
-        <w:t>Erdős-Rényi</w:t>
-      </w:r>
-    </w:p>
-    <w:p>
-      <w:r>
-        <w:rPr>
-          <w:noProof/>
-        </w:rPr>
-        <w:drawing>
-          <wp:inline distT="0" distB="0" distL="0" distR="0" wp14:anchorId="0E564873" wp14:editId="6937767E">
-            <wp:extent cx="5943600" cy="1982470"/>
-            <wp:effectExtent l="0" t="0" r="0" b="0"/>
-            <wp:docPr id="1241775004" name="Picture 1"/>
-            <wp:cNvGraphicFramePr>
-              <a:graphicFrameLocks xmlns:a="http://schemas.openxmlformats.org/drawingml/2006/main" noChangeAspect="1"/>
-            </wp:cNvGraphicFramePr>
-            <a:graphic xmlns:a="http://schemas.openxmlformats.org/drawingml/2006/main">
-              <a:graphicData uri="http://schemas.openxmlformats.org/drawingml/2006/picture">
-                <pic:pic xmlns:pic="http://schemas.openxmlformats.org/drawingml/2006/picture">
-                  <pic:nvPicPr>
-                    <pic:cNvPr id="1241775004" name=""/>
-                    <pic:cNvPicPr/>
-                  </pic:nvPicPr>
-                  <pic:blipFill>
-                    <a:blip r:embed="rId11"/>
-                    <a:stretch>
-                      <a:fillRect/>
-                    </a:stretch>
-                  </pic:blipFill>
-                  <pic:spPr>
-                    <a:xfrm>
-                      <a:off x="0" y="0"/>
-                      <a:ext cx="5943600" cy="1982470"/>
-                    </a:xfrm>
-                    <a:prstGeom prst="rect">
-                      <a:avLst/>
-                    </a:prstGeom>
-                  </pic:spPr>
-                </pic:pic>
-              </a:graphicData>
-            </a:graphic>
-          </wp:inline>
-        </w:drawing>
-      </w:r>
-    </w:p>
-    <w:p>
-      <w:pPr>
-        <w:pStyle w:val="Heading3"/>
-      </w:pPr>
-      <w:r>
-        <w:t>Ring</w:t>
-      </w:r>
-    </w:p>
-    <w:p>
-      <w:r>
-        <w:t xml:space="preserve">Something about how </w:t>
-      </w:r>
-      <m:oMath>
-        <m:sSub>
-          <m:sSubPr>
-            <m:ctrlPr>
-              <w:rPr>
-                <w:rFonts w:ascii="Cambria Math" w:hAnsi="Cambria Math"/>
-                <w:i/>
-              </w:rPr>
-            </m:ctrlPr>
-          </m:sSubPr>
-          <m:e>
-            <m:r>
-              <w:rPr>
-                <w:rFonts w:ascii="Cambria Math" w:hAnsi="Cambria Math"/>
-              </w:rPr>
-              <m:t>u</m:t>
-            </m:r>
-          </m:e>
-          <m:sub>
-            <m:r>
-              <w:rPr>
-                <w:rFonts w:ascii="Cambria Math" w:hAnsi="Cambria Math"/>
-              </w:rPr>
-              <m:t>2</m:t>
-            </m:r>
-          </m:sub>
-        </m:sSub>
-      </m:oMath>
-      <w:r>
-        <w:rPr>
-          <w:rFonts w:eastAsiaTheme="minorEastAsia"/>
-        </w:rPr>
-        <w:t xml:space="preserve"> and </w:t>
-      </w:r>
-      <m:oMath>
-        <m:sSub>
-          <m:sSubPr>
-            <m:ctrlPr>
-              <w:rPr>
-                <w:rFonts w:ascii="Cambria Math" w:eastAsiaTheme="minorEastAsia" w:hAnsi="Cambria Math"/>
-                <w:i/>
-              </w:rPr>
-            </m:ctrlPr>
-          </m:sSubPr>
-          <m:e>
-            <m:r>
-              <w:rPr>
-                <w:rFonts w:ascii="Cambria Math" w:eastAsiaTheme="minorEastAsia" w:hAnsi="Cambria Math"/>
-              </w:rPr>
-              <m:t>u</m:t>
-            </m:r>
-          </m:e>
-          <m:sub>
-            <m:r>
-              <w:rPr>
-                <w:rFonts w:ascii="Cambria Math" w:eastAsiaTheme="minorEastAsia" w:hAnsi="Cambria Math"/>
-              </w:rPr>
-              <m:t>3</m:t>
-            </m:r>
-          </m:sub>
-        </m:sSub>
-      </m:oMath>
-      <w:r>
-        <w:rPr>
-          <w:rFonts w:eastAsiaTheme="minorEastAsia"/>
-        </w:rPr>
-        <w:t xml:space="preserve"> have the same eigenvalue, and their eigenvectors are just orthogonal rotations. </w:t>
-      </w:r>
-      <m:oMath>
-        <m:sSub>
-          <m:sSubPr>
-            <m:ctrlPr>
-              <w:rPr>
-                <w:rFonts w:ascii="Cambria Math" w:eastAsiaTheme="minorEastAsia" w:hAnsi="Cambria Math"/>
-                <w:i/>
-              </w:rPr>
-            </m:ctrlPr>
-          </m:sSubPr>
-          <m:e>
-            <m:r>
-              <w:rPr>
-                <w:rFonts w:ascii="Cambria Math" w:eastAsiaTheme="minorEastAsia" w:hAnsi="Cambria Math"/>
-              </w:rPr>
-              <m:t>λ</m:t>
-            </m:r>
-          </m:e>
-          <m:sub>
-            <m:r>
-              <w:rPr>
-                <w:rFonts w:ascii="Cambria Math" w:eastAsiaTheme="minorEastAsia" w:hAnsi="Cambria Math"/>
-              </w:rPr>
-              <m:t>6</m:t>
-            </m:r>
-          </m:sub>
-        </m:sSub>
-      </m:oMath>
-      <w:r>
-        <w:rPr>
-          <w:rFonts w:eastAsiaTheme="minorEastAsia"/>
-        </w:rPr>
-        <w:t xml:space="preserve"> </w:t>
-      </w:r>
-      <w:r>
-        <w:rPr>
-          <w:rFonts w:eastAsiaTheme="minorEastAsia"/>
-        </w:rPr>
-        <w:t xml:space="preserve">and </w:t>
-      </w:r>
-      <m:oMath>
-        <m:sSub>
-          <m:sSubPr>
-            <m:ctrlPr>
-              <w:rPr>
-                <w:rFonts w:ascii="Cambria Math" w:eastAsiaTheme="minorEastAsia" w:hAnsi="Cambria Math"/>
-                <w:i/>
-              </w:rPr>
-            </m:ctrlPr>
-          </m:sSubPr>
-          <m:e>
-            <m:r>
-              <w:rPr>
-                <w:rFonts w:ascii="Cambria Math" w:eastAsiaTheme="minorEastAsia" w:hAnsi="Cambria Math"/>
-              </w:rPr>
-              <m:t>u</m:t>
-            </m:r>
-          </m:e>
-          <m:sub>
-            <m:r>
-              <w:rPr>
-                <w:rFonts w:ascii="Cambria Math" w:eastAsiaTheme="minorEastAsia" w:hAnsi="Cambria Math"/>
-              </w:rPr>
-              <m:t>6</m:t>
-            </m:r>
-          </m:sub>
-        </m:sSub>
-      </m:oMath>
-      <w:r>
-        <w:rPr>
-          <w:rFonts w:eastAsiaTheme="minorEastAsia"/>
-        </w:rPr>
-        <w:t xml:space="preserve"> </w:t>
-      </w:r>
-      <w:r>
-        <w:rPr>
-          <w:rFonts w:eastAsiaTheme="minorEastAsia"/>
-        </w:rPr>
-        <w:t xml:space="preserve">seem to be a harmonic of a lower eigenvalue. </w:t>
-      </w:r>
-    </w:p>
-    <w:p>
-      <w:r>
-        <w:rPr>
-          <w:noProof/>
-        </w:rPr>
-        <w:drawing>
-          <wp:inline distT="0" distB="0" distL="0" distR="0" wp14:anchorId="297074E3" wp14:editId="5DA5A595">
-            <wp:extent cx="5943600" cy="1981200"/>
-            <wp:effectExtent l="0" t="0" r="0" b="0"/>
-            <wp:docPr id="1860590533" name="Picture 1"/>
-            <wp:cNvGraphicFramePr>
-              <a:graphicFrameLocks xmlns:a="http://schemas.openxmlformats.org/drawingml/2006/main" noChangeAspect="1"/>
-            </wp:cNvGraphicFramePr>
-            <a:graphic xmlns:a="http://schemas.openxmlformats.org/drawingml/2006/main">
-              <a:graphicData uri="http://schemas.openxmlformats.org/drawingml/2006/picture">
-                <pic:pic xmlns:pic="http://schemas.openxmlformats.org/drawingml/2006/picture">
-                  <pic:nvPicPr>
-                    <pic:cNvPr id="1860590533" name=""/>
-                    <pic:cNvPicPr/>
-                  </pic:nvPicPr>
-                  <pic:blipFill>
-                    <a:blip r:embed="rId12"/>
-                    <a:stretch>
-                      <a:fillRect/>
-                    </a:stretch>
-                  </pic:blipFill>
-                  <pic:spPr>
-                    <a:xfrm>
-                      <a:off x="0" y="0"/>
-                      <a:ext cx="5943600" cy="1981200"/>
-                    </a:xfrm>
-                    <a:prstGeom prst="rect">
-                      <a:avLst/>
-                    </a:prstGeom>
-                  </pic:spPr>
-                </pic:pic>
-              </a:graphicData>
-            </a:graphic>
-          </wp:inline>
-        </w:drawing>
-      </w:r>
-    </w:p>
-    <w:p>
-      <w:pPr>
-        <w:pStyle w:val="Heading3"/>
-      </w:pPr>
-      <w:r>
-        <w:t>Cora</w:t>
-      </w:r>
-    </w:p>
-    <w:p>
-      <w:pPr>
         <w:rPr>
           <w:rFonts w:eastAsiaTheme="minorEastAsia"/>
         </w:rPr>
@@ -1389,7 +1142,6 @@
         <w:rPr>
           <w:noProof/>
         </w:rPr>
-        <w:lastRenderedPageBreak/>
         <w:drawing>
           <wp:inline distT="0" distB="0" distL="0" distR="0" wp14:anchorId="587A2370" wp14:editId="244A0BEB">
             <wp:extent cx="5943600" cy="1982470"/>
@@ -1406,7 +1158,7 @@
                     <pic:cNvPicPr/>
                   </pic:nvPicPr>
                   <pic:blipFill>
-                    <a:blip r:embed="rId13"/>
+                    <a:blip r:embed="rId11"/>
                     <a:stretch>
                       <a:fillRect/>
                     </a:stretch>
@@ -1515,7 +1267,7 @@
                           </pic:cNvPicPr>
                         </pic:nvPicPr>
                         <pic:blipFill>
-                          <a:blip r:embed="rId14">
+                          <a:blip r:embed="rId12">
                             <a:extLst>
                               <a:ext uri="{28A0092B-C50C-407E-A947-70E740481C1C}">
                                 <a14:useLocalDpi xmlns:a14="http://schemas.microsoft.com/office/drawing/2010/main" val="0"/>
@@ -1544,7 +1296,7 @@
                           </pic:cNvPicPr>
                         </pic:nvPicPr>
                         <pic:blipFill>
-                          <a:blip r:embed="rId15">
+                          <a:blip r:embed="rId13">
                             <a:extLst>
                               <a:ext uri="{28A0092B-C50C-407E-A947-70E740481C1C}">
                                 <a14:useLocalDpi xmlns:a14="http://schemas.microsoft.com/office/drawing/2010/main" val="0"/>
@@ -2513,6 +2265,7 @@
   <w:style w:type="character" w:default="1" w:styleId="DefaultParagraphFont">
     <w:name w:val="Default Paragraph Font"/>
     <w:uiPriority w:val="1"/>
+    <w:semiHidden/>
     <w:unhideWhenUsed/>
   </w:style>
   <w:style w:type="table" w:default="1" w:styleId="TableNormal">

</xml_diff>